<commit_message>
Mises à jour Allegresse
</commit_message>
<xml_diff>
--- a/allegresse/allegresse.docx
+++ b/allegresse/allegresse.docx
@@ -3248,7 +3248,13 @@
         <w:t>’</w:t>
       </w:r>
       <w:r>
-        <w:t>était elles qui me secouaient</w:t>
+        <w:t>était e</w:t>
+      </w:r>
+      <w:r>
+        <w:t>ux</w:t>
+      </w:r>
+      <w:r>
+        <w:t xml:space="preserve"> qui me secouaient</w:t>
       </w:r>
       <w:r>
         <w:t> ;</w:t>

</xml_diff>